<commit_message>
Rebuild the red team Word copy after 5ee96b2
Co-Authored-By: Claude Opus 5 <noreply@anthropic.com>
</commit_message>
<xml_diff>
--- a/briefs/2027-military-service-credit-cost-window/05-Red-Team-Review.docx
+++ b/briefs/2027-military-service-credit-cost-window/05-Red-Team-Review.docx
@@ -9583,7 +9583,25 @@
         <w:t>and</w:t>
       </w:r>
       <w:r>
-        <w:t xml:space="preserve"> the baseline rate is unlawful as to the cheapest member.</w:t>
+        <w:t xml:space="preserve"> the baseline rate is unlawful as to the cheapest member. Annex 2 Closure § 4.8.1 found that four-class instance independently and calls it an inconsistency between the ceiling and the published-rate floor; </w:t>
+      </w:r>
+      <w:r>
+        <w:rPr>
+          <w:b/>
+        </w:rPr>
+        <w:t>S-9 is the general case of it.</w:t>
+      </w:r>
+      <w:r>
+        <w:t xml:space="preserve"> The defect is not confined to four classes at their minimum — it bites for </w:t>
+      </w:r>
+      <w:r>
+        <w:rPr>
+          <w:i/>
+        </w:rPr>
+        <w:t>every individual member</w:t>
+      </w:r>
+      <w:r>
+        <w:t xml:space="preserve"> below the break-even purchase age, in every class, and it has a price tag the annex does not yet carry.</w:t>
       </w:r>
     </w:p>
     <w:p>
@@ -9703,7 +9721,56 @@
         <w:t>F-1's conclusion is unchanged and stronger: 100% is unreachable at any lawful setting.</w:t>
       </w:r>
       <w:r>
-        <w:t xml:space="preserve"> The error was in the band's width, not its direction. Fiscal &amp; Impact Modeler should quote 0%–96% / mean ~63% on the full-cost reading, or 10%–16% on the statutory reading of F-1A — not 25%–73%.</w:t>
+        <w:t xml:space="preserve"> The error was in the band's width, not its direction.</w:t>
+      </w:r>
+    </w:p>
+    <w:p>
+      <w:r>
+        <w:rPr>
+          <w:b/>
+        </w:rPr>
+        <w:t>This correction has already landed independently.</w:t>
+      </w:r>
+      <w:r>
+        <w:t xml:space="preserve"> Annex 2 Closure § 4.8.1 (revised October 25, commit </w:t>
+      </w:r>
+      <w:r>
+        <w:rPr>
+          <w:rFonts w:ascii="Consolas" w:hAnsi="Consolas"/>
+          <w:color w:val="303030"/>
+          <w:sz w:val="18"/>
+        </w:rPr>
+        <w:t>b0aa4fe</w:t>
+      </w:r>
+      <w:r>
+        <w:t xml:space="preserve">) withdraws the "$0 by construction" sentence, re-derives the band at </w:t>
+      </w:r>
+      <w:r>
+        <w:rPr>
+          <w:b/>
+        </w:rPr>
+        <w:t>0%–96% with a 59%–66% class mean and 23% in the Plan 1 long-service cohort</w:t>
+      </w:r>
+      <w:r>
+        <w:t xml:space="preserve">, publishes the </w:t>
+      </w:r>
+      <w:r>
+        <w:rPr>
+          <w:b/>
+        </w:rPr>
+        <w:t>$20M–$48M</w:t>
+      </w:r>
+      <w:r>
+        <w:t xml:space="preserve"> residual at 20% take-up, and reaches the four-class baseline-breach point at § 4.8.1 on its own. That annex is now the controlling statement of the band and it is right; the figure to strike wherever it has been carried forward is my own first-pass "25%–73%", and the figure to quote alongside the band is the </w:t>
+      </w:r>
+      <w:r>
+        <w:rPr>
+          <w:b/>
+        </w:rPr>
+        <w:t>10%–16%</w:t>
+      </w:r>
+      <w:r>
+        <w:t xml:space="preserve"> ceiling of F-1A, which § 4.8.1 does not yet reflect.</w:t>
       </w:r>
     </w:p>
     <w:p>

</xml_diff>